<commit_message>
revision and clean up
</commit_message>
<xml_diff>
--- a/inst/RStats/Equivalence_Testing/Equivalence.docx
+++ b/inst/RStats/Equivalence_Testing/Equivalence.docx
@@ -13,7 +13,7 @@
     <w:bookmarkStart w:id="20" w:name="purpose"/>
     <w:p>
       <w:pPr>
-        <w:pStyle w:val="Heading2"/>
+        <w:pStyle w:val="Heading1"/>
       </w:pPr>
       <w:r>
         <w:t xml:space="preserve">Purpose</w:t>
@@ -24,7 +24,7 @@
         <w:pStyle w:val="FirstParagraph"/>
       </w:pPr>
       <w:r>
-        <w:t xml:space="preserve">This supplementary document provides a neutral, evidence-based analysis of the EFSA bee guidance framework for non-inferiority testing, accompanied by R code that:</w:t>
+        <w:t xml:space="preserve">This supplementary document provides example calculations following the EFSA bee guidance framework for non-inferiority testing, accompanied by R code that:</w:t>
       </w:r>
     </w:p>
     <w:p>
@@ -219,10 +219,47 @@
         <w:pStyle w:val="FirstParagraph"/>
       </w:pPr>
       <w:r>
-        <w:t xml:space="preserve">The analysis shows that under EFSA’s lenient α = 0.20 framework, demonstrating non-inferiority for a 5% reduction still requires substantially larger samples (~77 per arm for 80% power) than conventional difference testing for a 15% reduction (~24 per arm). This reflects the fundamental statistical challenge: proving safety (ruling out harm beyond a margin) is more demanding than detecting harm.</w:t>
+        <w:t xml:space="preserve">The analysis shows that under EFSA’s lenient</w:t>
+      </w:r>
+      <w:r>
+        <w:t xml:space="preserve"> </w:t>
+      </w:r>
+      <m:oMath>
+        <m:r>
+          <m:t>α</m:t>
+        </m:r>
+      </m:oMath>
+      <w:r>
+        <w:t xml:space="preserve"> </w:t>
+      </w:r>
+      <w:r>
+        <w:t xml:space="preserve">= 0.20 framework, demonstrating non-inferiority for a 5% reduction still requires substantially larger samples (~77 per group for 80% power) than conventional difference testing for a 15% reduction (~14 per arm under</w:t>
+      </w:r>
+      <w:r>
+        <w:t xml:space="preserve"> </w:t>
+      </w:r>
+      <m:oMath>
+        <m:r>
+          <m:t>α</m:t>
+        </m:r>
+      </m:oMath>
+      <w:r>
+        <w:t xml:space="preserve"> </w:t>
+      </w:r>
+      <w:r>
+        <w:t xml:space="preserve">= 0.20). This reflects the fundamental statistical challenge: proving safety (ruling out harm beyond a margin) is more demanding than detecting harm.</w:t>
       </w:r>
     </w:p>
     <w:bookmarkEnd w:id="20"/>
+    <w:bookmarkStart w:id="24" w:name="methods"/>
+    <w:p>
+      <w:pPr>
+        <w:pStyle w:val="Heading1"/>
+      </w:pPr>
+      <w:r>
+        <w:t xml:space="preserve">Methods</w:t>
+      </w:r>
+    </w:p>
     <w:bookmarkStart w:id="21" w:name="mapping-between-α-and-cis"/>
     <w:p>
       <w:pPr>
@@ -263,9 +300,15 @@
       <w:r>
         <w:t xml:space="preserve">Equivalence (non-inferiority) criterion:</w:t>
       </w:r>
-      <w:r>
-        <w:t xml:space="preserve"> </w:t>
-      </w:r>
+    </w:p>
+    <w:p>
+      <w:pPr>
+        <w:pStyle w:val="Compact"/>
+        <w:numPr>
+          <w:ilvl w:val="0"/>
+          <w:numId w:val="1005"/>
+        </w:numPr>
+      </w:pPr>
       <w:r>
         <w:t xml:space="preserve">Reject</w:t>
       </w:r>
@@ -303,8 +346,8 @@
         <m:d>
           <m:dPr>
             <m:begChr m:val="("/>
+            <m:endChr m:val=")"/>
             <m:sepChr m:val=""/>
-            <m:endChr m:val=")"/>
             <m:grow/>
           </m:dPr>
           <m:e>
@@ -354,8 +397,8 @@
         <m:d>
           <m:dPr>
             <m:begChr m:val="("/>
+            <m:endChr m:val=")"/>
             <m:sepChr m:val=""/>
-            <m:endChr m:val=")"/>
             <m:grow/>
           </m:dPr>
           <m:e>
@@ -365,9 +408,15 @@
           </m:e>
         </m:d>
       </m:oMath>
-      <w:r>
-        <w:t xml:space="preserve"> </w:t>
-      </w:r>
+    </w:p>
+    <w:p>
+      <w:pPr>
+        <w:pStyle w:val="Compact"/>
+        <w:numPr>
+          <w:ilvl w:val="0"/>
+          <w:numId w:val="1005"/>
+        </w:numPr>
+      </w:pPr>
       <w:r>
         <w:t xml:space="preserve">if</w:t>
       </w:r>
@@ -405,8 +454,8 @@
         <m:d>
           <m:dPr>
             <m:begChr m:val="("/>
+            <m:endChr m:val=")"/>
             <m:sepChr m:val=""/>
-            <m:endChr m:val=")"/>
             <m:grow/>
           </m:dPr>
           <m:e>
@@ -430,8 +479,8 @@
         <m:d>
           <m:dPr>
             <m:begChr m:val="("/>
+            <m:endChr m:val=")"/>
             <m:sepChr m:val=""/>
-            <m:endChr m:val=")"/>
             <m:grow/>
           </m:dPr>
           <m:e>
@@ -444,9 +493,15 @@
       <w:r>
         <w:t xml:space="preserve">,</w:t>
       </w:r>
-      <w:r>
-        <w:t xml:space="preserve"> </w:t>
-      </w:r>
+    </w:p>
+    <w:p>
+      <w:pPr>
+        <w:pStyle w:val="Compact"/>
+        <w:numPr>
+          <w:ilvl w:val="0"/>
+          <w:numId w:val="1005"/>
+        </w:numPr>
+      </w:pPr>
       <w:r>
         <w:t xml:space="preserve">where</w:t>
       </w:r>
@@ -472,8 +527,8 @@
         <m:d>
           <m:dPr>
             <m:begChr m:val="("/>
+            <m:endChr m:val=")"/>
             <m:sepChr m:val=""/>
-            <m:endChr m:val=")"/>
             <m:grow/>
           </m:dPr>
           <m:e>
@@ -491,14 +546,6 @@
         <w:t xml:space="preserve">.</w:t>
       </w:r>
     </w:p>
-    <w:p>
-      <w:pPr>
-        <w:pStyle w:val="BodyText"/>
-      </w:pPr>
-      <w:r>
-        <w:t xml:space="preserve">—</w:t>
-      </w:r>
-    </w:p>
     <w:bookmarkEnd w:id="21"/>
     <w:bookmarkStart w:id="22" w:name="Xb07de48f2a755f2b293c8fe1ebe71e15b968419"/>
     <w:p>
@@ -516,40 +563,70 @@
       <w:r>
         <w:t xml:space="preserve">Assumptions (parameterized in code below):</w:t>
       </w:r>
-      <w:r>
-        <w:t xml:space="preserve"> </w:t>
-      </w:r>
-      <w:r>
-        <w:t xml:space="preserve">- Control mean = 20,000 organisms (e.g., colony size)</w:t>
-      </w:r>
-      <w:r>
-        <w:t xml:space="preserve"> </w:t>
-      </w:r>
-      <w:r>
-        <w:t xml:space="preserve">- Treated mean = 5% reduction → 19,000; ratio = 0.95</w:t>
-      </w:r>
-      <w:r>
-        <w:t xml:space="preserve"> </w:t>
-      </w:r>
-      <w:r>
-        <w:t xml:space="preserve">- Coefficient of variation (CV) = 20%</w:t>
-      </w:r>
-      <w:r>
-        <w:t xml:space="preserve"> </w:t>
-      </w:r>
-      <w:r>
-        <w:t xml:space="preserve">- Log-normal model with equal CV across arms</w:t>
-      </w:r>
-      <w:r>
-        <w:t xml:space="preserve"> </w:t>
-      </w:r>
-      <w:r>
-        <w:t xml:space="preserve">- Replicates per arm nC = nT (we’ll explore n = 6, 12, 20)</w:t>
-      </w:r>
     </w:p>
     <w:p>
       <w:pPr>
-        <w:pStyle w:val="BodyText"/>
+        <w:pStyle w:val="Compact"/>
+        <w:numPr>
+          <w:ilvl w:val="0"/>
+          <w:numId w:val="1006"/>
+        </w:numPr>
+      </w:pPr>
+      <w:r>
+        <w:t xml:space="preserve">Control mean = 20,000 organisms (e.g., colony size)</w:t>
+      </w:r>
+    </w:p>
+    <w:p>
+      <w:pPr>
+        <w:pStyle w:val="Compact"/>
+        <w:numPr>
+          <w:ilvl w:val="0"/>
+          <w:numId w:val="1006"/>
+        </w:numPr>
+      </w:pPr>
+      <w:r>
+        <w:t xml:space="preserve">Treated mean = 5% reduction → 19,000; ratio = 0.95</w:t>
+      </w:r>
+    </w:p>
+    <w:p>
+      <w:pPr>
+        <w:pStyle w:val="Compact"/>
+        <w:numPr>
+          <w:ilvl w:val="0"/>
+          <w:numId w:val="1006"/>
+        </w:numPr>
+      </w:pPr>
+      <w:r>
+        <w:t xml:space="preserve">Coefficient of variation (CV) = 20%</w:t>
+      </w:r>
+    </w:p>
+    <w:p>
+      <w:pPr>
+        <w:pStyle w:val="Compact"/>
+        <w:numPr>
+          <w:ilvl w:val="0"/>
+          <w:numId w:val="1006"/>
+        </w:numPr>
+      </w:pPr>
+      <w:r>
+        <w:t xml:space="preserve">Log-normal model with equal CV across arms</w:t>
+      </w:r>
+    </w:p>
+    <w:p>
+      <w:pPr>
+        <w:pStyle w:val="Compact"/>
+        <w:numPr>
+          <w:ilvl w:val="0"/>
+          <w:numId w:val="1006"/>
+        </w:numPr>
+      </w:pPr>
+      <w:r>
+        <w:t xml:space="preserve">Replicates per group nC = nT (we’ll explore n = 6, 12, 20)</w:t>
+      </w:r>
+    </w:p>
+    <w:p>
+      <w:pPr>
+        <w:pStyle w:val="FirstParagraph"/>
       </w:pPr>
       <w:r>
         <w:t xml:space="preserve">Mapping CV to the log scale:</w:t>
@@ -591,8 +668,8 @@
           <m:d>
             <m:dPr>
               <m:begChr m:val="("/>
+              <m:endChr m:val=")"/>
               <m:sepChr m:val=""/>
-              <m:endChr m:val=")"/>
               <m:grow/>
             </m:dPr>
             <m:e>
@@ -656,8 +733,8 @@
               <m:d>
                 <m:dPr>
                   <m:begChr m:val="("/>
+                  <m:endChr m:val=")"/>
                   <m:sepChr m:val=""/>
-                  <m:endChr m:val=")"/>
                   <m:grow/>
                 </m:dPr>
                 <m:e>
@@ -704,7 +781,68 @@
         <w:pStyle w:val="FirstParagraph"/>
       </w:pPr>
       <w:r>
-        <w:t xml:space="preserve">On the log scale, if X_C, X_T are normal with common variance σ^2, the standard error for the difference in means is:</w:t>
+        <w:t xml:space="preserve">On the log scale, if</w:t>
+      </w:r>
+      <w:r>
+        <w:t xml:space="preserve"> </w:t>
+      </w:r>
+      <m:oMath>
+        <m:sSub>
+          <m:e>
+            <m:r>
+              <m:t>X</m:t>
+            </m:r>
+          </m:e>
+          <m:sub>
+            <m:r>
+              <m:t>C</m:t>
+            </m:r>
+          </m:sub>
+        </m:sSub>
+        <m:r>
+          <m:rPr>
+            <m:sty m:val="p"/>
+          </m:rPr>
+          <m:t>,</m:t>
+        </m:r>
+        <m:sSub>
+          <m:e>
+            <m:r>
+              <m:t>X</m:t>
+            </m:r>
+          </m:e>
+          <m:sub>
+            <m:r>
+              <m:t>T</m:t>
+            </m:r>
+          </m:sub>
+        </m:sSub>
+      </m:oMath>
+      <w:r>
+        <w:t xml:space="preserve"> </w:t>
+      </w:r>
+      <w:r>
+        <w:t xml:space="preserve">are normal with common variance</w:t>
+      </w:r>
+      <w:r>
+        <w:t xml:space="preserve"> </w:t>
+      </w:r>
+      <m:oMath>
+        <m:sSup>
+          <m:e>
+            <m:r>
+              <m:t>σ</m:t>
+            </m:r>
+          </m:e>
+          <m:sup>
+            <m:r>
+              <m:t>2</m:t>
+            </m:r>
+          </m:sup>
+        </m:sSup>
+      </m:oMath>
+      <w:r>
+        <w:t xml:space="preserve">, the standard error for the difference in means is:</w:t>
       </w:r>
     </w:p>
     <w:p>
@@ -725,8 +863,8 @@
           <m:d>
             <m:dPr>
               <m:begChr m:val="("/>
+              <m:endChr m:val=")"/>
               <m:sepChr m:val=""/>
-              <m:endChr m:val=")"/>
               <m:grow/>
             </m:dPr>
             <m:e>
@@ -847,8 +985,8 @@
           <m:d>
             <m:dPr>
               <m:begChr m:val="("/>
+              <m:endChr m:val=")"/>
               <m:sepChr m:val=""/>
-              <m:endChr m:val=")"/>
               <m:grow/>
             </m:dPr>
             <m:e>
@@ -871,7 +1009,15 @@
         <w:pStyle w:val="FirstParagraph"/>
       </w:pPr>
       <w:r>
-        <w:t xml:space="preserve">Two-sided CI for θ at level 1 − 2α:</w:t>
+        <w:t xml:space="preserve">Two-sided CI for θ at level 1 − 2</w:t>
+      </w:r>
+      <m:oMath>
+        <m:r>
+          <m:t>α</m:t>
+        </m:r>
+      </m:oMath>
+      <w:r>
+        <w:t xml:space="preserve">:</w:t>
       </w:r>
     </w:p>
     <w:p>
@@ -932,8 +1078,8 @@
           <m:d>
             <m:dPr>
               <m:begChr m:val="("/>
+              <m:endChr m:val=")"/>
               <m:sepChr m:val=""/>
-              <m:endChr m:val=")"/>
               <m:grow/>
             </m:dPr>
             <m:e>
@@ -966,14 +1112,6 @@
         <w:t xml:space="preserve">transform back with exp() to obtain the CI for the ratio treated/control. Compare the CI lower bound to 0.90.</w:t>
       </w:r>
     </w:p>
-    <w:p>
-      <w:pPr>
-        <w:pStyle w:val="BodyText"/>
-      </w:pPr>
-      <w:r>
-        <w:t xml:space="preserve">—</w:t>
-      </w:r>
-    </w:p>
     <w:bookmarkEnd w:id="22"/>
     <w:bookmarkStart w:id="23" w:name="Xd02151791aa05e605124aedca03abd662ff2bb0"/>
     <w:p>
@@ -3489,7 +3627,7 @@
         <w:rPr>
           <w:rStyle w:val="StringTok"/>
         </w:rPr>
-        <w:t xml:space="preserve">Approximate n per arm needed to pass at alpha=0.20 (60%% CI): %s</w:t>
+        <w:t xml:space="preserve">Approximate n per group  needed to pass at alpha=0.20 (60%% CI): %s</w:t>
       </w:r>
       <w:r>
         <w:rPr>
@@ -3536,7 +3674,7 @@
         <w:rPr>
           <w:rStyle w:val="VerbatimChar"/>
         </w:rPr>
-        <w:t xml:space="preserve">## Approximate n per arm needed to pass at alpha=0.20 (60% CI): 20</w:t>
+        <w:t xml:space="preserve">## Approximate n per group  needed to pass at alpha=0.20 (60% CI): 20</w:t>
       </w:r>
     </w:p>
     <w:p>
@@ -3571,7 +3709,7 @@
         <w:rPr>
           <w:rStyle w:val="StringTok"/>
         </w:rPr>
-        <w:t xml:space="preserve">"Approximate n per arm needed to pass at ~95%% two-sided criterion: %s</w:t>
+        <w:t xml:space="preserve">"Approximate n per group  needed to pass at ~95%% two-sided criterion: %s</w:t>
       </w:r>
       <w:r>
         <w:rPr>
@@ -3600,7 +3738,7 @@
         <w:rPr>
           <w:rStyle w:val="VerbatimChar"/>
         </w:rPr>
-        <w:t xml:space="preserve">## Approximate n per arm needed to pass at ~95% two-sided criterion: 104</w:t>
+        <w:t xml:space="preserve">## Approximate n per group  needed to pass at ~95% two-sided criterion: 104</w:t>
       </w:r>
     </w:p>
     <w:p>
@@ -3616,7 +3754,7 @@
         <w:pStyle w:val="Compact"/>
         <w:numPr>
           <w:ilvl w:val="0"/>
-          <w:numId w:val="1005"/>
+          <w:numId w:val="1007"/>
         </w:numPr>
       </w:pPr>
       <w:r>
@@ -3628,11 +3766,22 @@
         <w:pStyle w:val="Compact"/>
         <w:numPr>
           <w:ilvl w:val="0"/>
-          <w:numId w:val="1005"/>
+          <w:numId w:val="1007"/>
         </w:numPr>
       </w:pPr>
       <w:r>
-        <w:t xml:space="preserve">For example, with n = 6 per arm, the 60% CI lower bound is typically below 0.90, so non-inferiority (α = 0.2; margin = 10%) fails.</w:t>
+        <w:t xml:space="preserve">For example, with n = 6 per arm, the 60% CI lower bound is typically below 0.90, so non-inferiority (</w:t>
+      </w:r>
+      <m:oMath>
+        <m:r>
+          <m:t>α</m:t>
+        </m:r>
+      </m:oMath>
+      <w:r>
+        <w:t xml:space="preserve"> </w:t>
+      </w:r>
+      <w:r>
+        <w:t xml:space="preserve">= 0.2; margin = 10%) fails.</w:t>
       </w:r>
     </w:p>
     <w:p>
@@ -3640,11 +3789,36 @@
         <w:pStyle w:val="Compact"/>
         <w:numPr>
           <w:ilvl w:val="0"/>
-          <w:numId w:val="1005"/>
+          <w:numId w:val="1007"/>
         </w:numPr>
       </w:pPr>
       <w:r>
-        <w:t xml:space="preserve">The approximate n per arm required to pass at α = 0.2 (60% CI) is about 20 (per arm) under these assumptions; at a 95% two-sided standard it exceeds 100 per arm. This illustrates that even with a lenient α, demonstrating</w:t>
+        <w:t xml:space="preserve">The approximate n per group required to pass at</w:t>
+      </w:r>
+      <w:r>
+        <w:t xml:space="preserve"> </w:t>
+      </w:r>
+      <m:oMath>
+        <m:r>
+          <m:t>α</m:t>
+        </m:r>
+      </m:oMath>
+      <w:r>
+        <w:t xml:space="preserve"> </w:t>
+      </w:r>
+      <w:r>
+        <w:t xml:space="preserve">= 0.2 (60% CI) is about 20 (per arm) under these assumptions; at a 95% two-sided standard it exceeds 100 per arm. This illustrates that even with a lenient</w:t>
+      </w:r>
+      <w:r>
+        <w:t xml:space="preserve"> </w:t>
+      </w:r>
+      <m:oMath>
+        <m:r>
+          <m:t>α</m:t>
+        </m:r>
+      </m:oMath>
+      <w:r>
+        <w:t xml:space="preserve">, demonstrating</w:t>
       </w:r>
       <w:r>
         <w:t xml:space="preserve"> </w:t>
@@ -3664,7 +3838,21 @@
         <w:pStyle w:val="FirstParagraph"/>
       </w:pPr>
       <w:r>
-        <w:t xml:space="preserve">Using a one-sided α = 0.2 non-inferiority test with a 10% reduction margin is equivalent to requiring the lower bound of a two-sided 60% CI for the treated/control ratio to exceed 0.90. Under a log-normal model with CV = 20% and modest replication, an observed 5% reduction (ratio = 0.95) typically fails this test unless n ≈ 20 per group or larger; at conventional 95% CI levels the replication burden is substantially higher.</w:t>
+        <w:t xml:space="preserve">Using a one-sided</w:t>
+      </w:r>
+      <w:r>
+        <w:t xml:space="preserve"> </w:t>
+      </w:r>
+      <m:oMath>
+        <m:r>
+          <m:t>α</m:t>
+        </m:r>
+      </m:oMath>
+      <w:r>
+        <w:t xml:space="preserve"> </w:t>
+      </w:r>
+      <w:r>
+        <w:t xml:space="preserve">= 0.2 non-inferiority test with a 10% reduction margin is equivalent to requiring the lower bound of a two-sided 60% CI for the treated/control ratio to exceed 0.90. Under a log-normal model with CV = 20% and modest replication, an observed 5% reduction (ratio = 0.95) typically fails this test unless n ≈ 20 per group or larger; at conventional 95% CI levels the replication burden is substantially higher.</w:t>
       </w:r>
     </w:p>
     <w:p>
@@ -3672,11 +3860,26 @@
         <w:pStyle w:val="BodyText"/>
       </w:pPr>
       <w:r>
-        <w:t xml:space="preserve">This example highlights that the prescribed α and margin may not be empirically verifiable under typical variance and replication, motivating feasibility assessment alongside methodological selection.</w:t>
+        <w:t xml:space="preserve">This example highlights that the prescribed</w:t>
+      </w:r>
+      <w:r>
+        <w:t xml:space="preserve"> </w:t>
+      </w:r>
+      <m:oMath>
+        <m:r>
+          <m:t>α</m:t>
+        </m:r>
+      </m:oMath>
+      <w:r>
+        <w:t xml:space="preserve"> </w:t>
+      </w:r>
+      <w:r>
+        <w:t xml:space="preserve">and margin may not be empirically verifiable under typical variance and replication, motivating feasibility assessment alongside methodological selection.</w:t>
       </w:r>
     </w:p>
     <w:bookmarkEnd w:id="23"/>
-    <w:bookmarkStart w:id="32" w:name="X58c5d4d2d097296be798ae5021e9e6e7a15767e"/>
+    <w:bookmarkEnd w:id="24"/>
+    <w:bookmarkStart w:id="34" w:name="X58c5d4d2d097296be798ae5021e9e6e7a15767e"/>
     <w:p>
       <w:pPr>
         <w:pStyle w:val="Heading1"/>
@@ -3685,13 +3888,13 @@
         <w:t xml:space="preserve">Comparing Difference Test and Equivalence Test</w:t>
       </w:r>
     </w:p>
-    <w:bookmarkStart w:id="24" w:name="mdd-vs-real-power"/>
+    <w:bookmarkStart w:id="25" w:name="considering-alpha-only-mdd-vs-real-power"/>
     <w:p>
       <w:pPr>
         <w:pStyle w:val="Heading2"/>
       </w:pPr>
       <w:r>
-        <w:t xml:space="preserve">MDD vs Real Power</w:t>
+        <w:t xml:space="preserve">Considering alpha only (MDD) vs Real Power</w:t>
       </w:r>
     </w:p>
     <w:p>
@@ -3754,8 +3957,8 @@
               <m:d>
                 <m:dPr>
                   <m:begChr m:val="("/>
+                  <m:endChr m:val=")"/>
                   <m:sepChr m:val=""/>
-                  <m:endChr m:val=")"/>
                   <m:grow/>
                 </m:dPr>
                 <m:e>
@@ -3848,8 +4051,8 @@
               <m:d>
                 <m:dPr>
                   <m:begChr m:val="("/>
+                  <m:endChr m:val=")"/>
                   <m:sepChr m:val=""/>
-                  <m:endChr m:val=")"/>
                   <m:grow/>
                 </m:dPr>
                 <m:e>
@@ -3861,8 +4064,8 @@
                       <m:d>
                         <m:dPr>
                           <m:begChr m:val="("/>
+                          <m:endChr m:val=")"/>
                           <m:sepChr m:val=""/>
-                          <m:endChr m:val=")"/>
                           <m:grow/>
                         </m:dPr>
                         <m:e>
@@ -3971,8 +4174,8 @@
         <m:d>
           <m:dPr>
             <m:begChr m:val="("/>
+            <m:endChr m:val=")"/>
             <m:sepChr m:val=""/>
-            <m:endChr m:val=")"/>
             <m:grow/>
           </m:dPr>
           <m:e>
@@ -4035,8 +4238,8 @@
         <m:d>
           <m:dPr>
             <m:begChr m:val="("/>
+            <m:endChr m:val=")"/>
             <m:sepChr m:val=""/>
-            <m:endChr m:val=")"/>
             <m:grow/>
           </m:dPr>
           <m:e>
@@ -4078,8 +4281,8 @@
         <m:d>
           <m:dPr>
             <m:begChr m:val="("/>
+            <m:endChr m:val=")"/>
             <m:sepChr m:val=""/>
-            <m:endChr m:val=")"/>
             <m:grow/>
           </m:dPr>
           <m:e>
@@ -4103,8 +4306,8 @@
         <m:d>
           <m:dPr>
             <m:begChr m:val="("/>
+            <m:endChr m:val=")"/>
             <m:sepChr m:val=""/>
-            <m:endChr m:val=")"/>
             <m:grow/>
           </m:dPr>
           <m:e>
@@ -4129,7 +4332,21 @@
         <w:pStyle w:val="BodyText"/>
       </w:pPr>
       <w:r>
-        <w:t xml:space="preserve">For α = 0.20, power = 0.80:</w:t>
+        <w:t xml:space="preserve">For</w:t>
+      </w:r>
+      <w:r>
+        <w:t xml:space="preserve"> </w:t>
+      </w:r>
+      <m:oMath>
+        <m:r>
+          <m:t>α</m:t>
+        </m:r>
+      </m:oMath>
+      <w:r>
+        <w:t xml:space="preserve"> </w:t>
+      </w:r>
+      <w:r>
+        <w:t xml:space="preserve">= 0.20, power = 0.80:</w:t>
       </w:r>
       <w:r>
         <w:t xml:space="preserve"> </w:t>
@@ -4228,8 +4445,8 @@
             <m:d>
               <m:dPr>
                 <m:begChr m:val="("/>
+                <m:endChr m:val=")"/>
                 <m:sepChr m:val=""/>
-                <m:endChr m:val=")"/>
                 <m:grow/>
               </m:dPr>
               <m:e>
@@ -4306,8 +4523,8 @@
             <m:d>
               <m:dPr>
                 <m:begChr m:val="("/>
+                <m:endChr m:val=")"/>
                 <m:sepChr m:val=""/>
-                <m:endChr m:val=")"/>
                 <m:grow/>
               </m:dPr>
               <m:e>
@@ -4352,8 +4569,8 @@
         </m:r>
       </m:oMath>
     </w:p>
-    <w:bookmarkEnd w:id="24"/>
-    <w:bookmarkStart w:id="31" w:name="summary-of-design-and-key-results"/>
+    <w:bookmarkEnd w:id="25"/>
+    <w:bookmarkStart w:id="32" w:name="summary-of-design-and-key-results"/>
     <w:p>
       <w:pPr>
         <w:pStyle w:val="Heading2"/>
@@ -4362,7 +4579,7 @@
         <w:t xml:space="preserve">Summary of Design and Key Results</w:t>
       </w:r>
     </w:p>
-    <w:bookmarkStart w:id="25" w:name="study-design"/>
+    <w:bookmarkStart w:id="26" w:name="study-design"/>
     <w:p>
       <w:pPr>
         <w:pStyle w:val="Heading3"/>
@@ -4383,7 +4600,7 @@
         <w:t xml:space="preserve">Model</w:t>
       </w:r>
       <w:r>
-        <w:t xml:space="preserve">: Log-normal with equal variance; CV = 20%; equal sample sizes per arm</w:t>
+        <w:t xml:space="preserve">: Log-normal with equal variance; CV = 20%; equal sample sizes per group</w:t>
       </w:r>
       <w:r>
         <w:br/>
@@ -4468,18 +4685,33 @@
         <w:t xml:space="preserve">Test types</w:t>
       </w:r>
       <w:r>
-        <w:t xml:space="preserve">: One-sided non-inferiority (α = 0.05 or 0.20) vs. two-sided difference test (α = 0.05 or 0.20)</w:t>
+        <w:t xml:space="preserve">: One-sided non-inferiority (</w:t>
+      </w:r>
+      <m:oMath>
+        <m:r>
+          <m:t>α</m:t>
+        </m:r>
+      </m:oMath>
+      <w:r>
+        <w:t xml:space="preserve"> </w:t>
+      </w:r>
+      <w:r>
+        <w:t xml:space="preserve">= 0.05 or 0.20) vs. two-sided difference test (</w:t>
+      </w:r>
+      <m:oMath>
+        <m:r>
+          <m:t>α</m:t>
+        </m:r>
+      </m:oMath>
+      <w:r>
+        <w:t xml:space="preserve"> </w:t>
+      </w:r>
+      <w:r>
+        <w:t xml:space="preserve">= 0.05 or 0.20)</w:t>
       </w:r>
     </w:p>
-    <w:p>
-      <w:r>
-        <w:pict>
-          <v:rect style="width:0;height:1.5pt" o:hralign="center" o:hrstd="t" o:hr="t"/>
-        </w:pict>
-      </w:r>
-    </w:p>
-    <w:bookmarkEnd w:id="25"/>
-    <w:bookmarkStart w:id="28" w:name="key-findings"/>
+    <w:bookmarkEnd w:id="26"/>
+    <w:bookmarkStart w:id="29" w:name="key-findings"/>
     <w:p>
       <w:pPr>
         <w:pStyle w:val="Heading3"/>
@@ -4488,7 +4720,7 @@
         <w:t xml:space="preserve">Key Findings</w:t>
       </w:r>
     </w:p>
-    <w:bookmarkStart w:id="26" w:name="reduction-scenario-proving-safety"/>
+    <w:bookmarkStart w:id="27" w:name="reduction-scenario-proving-safety"/>
     <w:p>
       <w:pPr>
         <w:pStyle w:val="Heading4"/>
@@ -4575,7 +4807,7 @@
               <w:pStyle w:val="Compact"/>
             </w:pPr>
             <w:r>
-              <w:t xml:space="preserve">n per arm</w:t>
+              <w:t xml:space="preserve">n per group</w:t>
             </w:r>
           </w:p>
         </w:tc>
@@ -4808,11 +5040,25 @@
         <w:t xml:space="preserve">Minimum n (no power)</w:t>
       </w:r>
       <w:r>
-        <w:t xml:space="preserve">: 20 per arm (just meets α = 0.20 criterion)</w:t>
+        <w:t xml:space="preserve">: 20 per group (just meets</w:t>
+      </w:r>
+      <w:r>
+        <w:t xml:space="preserve"> </w:t>
+      </w:r>
+      <m:oMath>
+        <m:r>
+          <m:t>α</m:t>
+        </m:r>
+      </m:oMath>
+      <w:r>
+        <w:t xml:space="preserve"> </w:t>
+      </w:r>
+      <w:r>
+        <w:t xml:space="preserve">= 0.20 criterion)</w:t>
       </w:r>
     </w:p>
-    <w:bookmarkEnd w:id="26"/>
-    <w:bookmarkStart w:id="27" w:name="reduction-scenario-detecting-harm"/>
+    <w:bookmarkEnd w:id="27"/>
+    <w:bookmarkStart w:id="28" w:name="reduction-scenario-detecting-harm"/>
     <w:p>
       <w:pPr>
         <w:pStyle w:val="Heading4"/>
@@ -4898,7 +5144,7 @@
               <w:pStyle w:val="Compact"/>
             </w:pPr>
             <w:r>
-              <w:t xml:space="preserve">n per arm</w:t>
+              <w:t xml:space="preserve">n per group</w:t>
             </w:r>
           </w:p>
         </w:tc>
@@ -5129,19 +5375,23 @@
         <w:t xml:space="preserve">Minimum n (no power)</w:t>
       </w:r>
       <w:r>
-        <w:t xml:space="preserve">: 12 per arm (α = 0.05)</w:t>
+        <w:t xml:space="preserve">: 12 per group (</w:t>
+      </w:r>
+      <m:oMath>
+        <m:r>
+          <m:t>α</m:t>
+        </m:r>
+      </m:oMath>
+      <w:r>
+        <w:t xml:space="preserve"> </w:t>
+      </w:r>
+      <w:r>
+        <w:t xml:space="preserve">= 0.05)</w:t>
       </w:r>
     </w:p>
-    <w:p>
-      <w:r>
-        <w:pict>
-          <v:rect style="width:0;height:1.5pt" o:hralign="center" o:hrstd="t" o:hr="t"/>
-        </w:pict>
-      </w:r>
-    </w:p>
-    <w:bookmarkEnd w:id="27"/>
     <w:bookmarkEnd w:id="28"/>
-    <w:bookmarkStart w:id="29" w:name="critical-comparisons"/>
+    <w:bookmarkEnd w:id="29"/>
+    <w:bookmarkStart w:id="30" w:name="critical-comparisons"/>
     <w:p>
       <w:pPr>
         <w:pStyle w:val="Heading3"/>
@@ -5165,7 +5415,18 @@
         <w:br/>
       </w:r>
       <w:r>
-        <w:t xml:space="preserve">- Proving safety (5%, non-inferiority, α=0.20):</w:t>
+        <w:t xml:space="preserve">- Proving safety (5%, non-inferiority,</w:t>
+      </w:r>
+      <w:r>
+        <w:t xml:space="preserve"> </w:t>
+      </w:r>
+      <m:oMath>
+        <m:r>
+          <m:t>α</m:t>
+        </m:r>
+      </m:oMath>
+      <w:r>
+        <w:t xml:space="preserve">=0.20):</w:t>
       </w:r>
       <w:r>
         <w:t xml:space="preserve"> </w:t>
@@ -5181,7 +5442,18 @@
         <w:br/>
       </w:r>
       <w:r>
-        <w:t xml:space="preserve">- Detecting harm (15%, difference test, α=0.05):</w:t>
+        <w:t xml:space="preserve">- Detecting harm (15%, difference test,</w:t>
+      </w:r>
+      <w:r>
+        <w:t xml:space="preserve"> </w:t>
+      </w:r>
+      <m:oMath>
+        <m:r>
+          <m:t>α</m:t>
+        </m:r>
+      </m:oMath>
+      <w:r>
+        <w:t xml:space="preserve">=0.05):</w:t>
       </w:r>
       <w:r>
         <w:t xml:space="preserve"> </w:t>
@@ -5213,8 +5485,16 @@
         <w:t xml:space="preserve"> </w:t>
       </w:r>
       <w:r>
-        <w:t xml:space="preserve">despite more lenient α</w:t>
-      </w:r>
+        <w:t xml:space="preserve">despite more lenient</w:t>
+      </w:r>
+      <w:r>
+        <w:t xml:space="preserve"> </w:t>
+      </w:r>
+      <m:oMath>
+        <m:r>
+          <m:t>α</m:t>
+        </m:r>
+      </m:oMath>
     </w:p>
     <w:p>
       <w:pPr>
@@ -5237,7 +5517,21 @@
         <w:br/>
       </w:r>
       <w:r>
-        <w:t xml:space="preserve">- α = 0.20 (EFSA):</w:t>
+        <w:t xml:space="preserve">-</w:t>
+      </w:r>
+      <w:r>
+        <w:t xml:space="preserve"> </w:t>
+      </w:r>
+      <m:oMath>
+        <m:r>
+          <m:t>α</m:t>
+        </m:r>
+      </m:oMath>
+      <w:r>
+        <w:t xml:space="preserve"> </w:t>
+      </w:r>
+      <w:r>
+        <w:t xml:space="preserve">= 0.20 (EFSA):</w:t>
       </w:r>
       <w:r>
         <w:t xml:space="preserve"> </w:t>
@@ -5253,7 +5547,21 @@
         <w:br/>
       </w:r>
       <w:r>
-        <w:t xml:space="preserve">- α = 0.05 (stringent):</w:t>
+        <w:t xml:space="preserve">-</w:t>
+      </w:r>
+      <w:r>
+        <w:t xml:space="preserve"> </w:t>
+      </w:r>
+      <m:oMath>
+        <m:r>
+          <m:t>α</m:t>
+        </m:r>
+      </m:oMath>
+      <w:r>
+        <w:t xml:space="preserve"> </w:t>
+      </w:r>
+      <w:r>
+        <w:t xml:space="preserve">= 0.05 (stringent):</w:t>
       </w:r>
       <w:r>
         <w:t xml:space="preserve"> </w:t>
@@ -5279,7 +5587,33 @@
           <w:b/>
           <w:bCs/>
         </w:rPr>
-        <w:t xml:space="preserve">Reducing α from 0.20→0.05 increases sample size by 116%</w:t>
+        <w:t xml:space="preserve">Reducing</w:t>
+      </w:r>
+      <w:r>
+        <w:rPr>
+          <w:b/>
+          <w:bCs/>
+        </w:rPr>
+        <w:t xml:space="preserve"> </w:t>
+      </w:r>
+      <m:oMath>
+        <m:r>
+          <m:t>α</m:t>
+        </m:r>
+      </m:oMath>
+      <w:r>
+        <w:rPr>
+          <w:b/>
+          <w:bCs/>
+        </w:rPr>
+        <w:t xml:space="preserve"> </w:t>
+      </w:r>
+      <w:r>
+        <w:rPr>
+          <w:b/>
+          <w:bCs/>
+        </w:rPr>
+        <w:t xml:space="preserve">from 0.20→0.05 increases sample size by 116%</w:t>
       </w:r>
     </w:p>
     <w:p>
@@ -5313,7 +5647,21 @@
         <w:t xml:space="preserve"> </w:t>
       </w:r>
       <w:r>
-        <w:t xml:space="preserve">(just meets α criterion): typically 25-35% of power-adjusted n</w:t>
+        <w:t xml:space="preserve">(just meets</w:t>
+      </w:r>
+      <w:r>
+        <w:t xml:space="preserve"> </w:t>
+      </w:r>
+      <m:oMath>
+        <m:r>
+          <m:t>α</m:t>
+        </m:r>
+      </m:oMath>
+      <w:r>
+        <w:t xml:space="preserve"> </w:t>
+      </w:r>
+      <w:r>
+        <w:t xml:space="preserve">criterion): typically 25-35% of power-adjusted n</w:t>
       </w:r>
       <w:r>
         <w:t xml:space="preserve"> </w:t>
@@ -5354,15 +5702,8 @@
         <w:t xml:space="preserve">n = 77 needed for 80% power</w:t>
       </w:r>
     </w:p>
-    <w:p>
-      <w:r>
-        <w:pict>
-          <v:rect style="width:0;height:1.5pt" o:hralign="center" o:hrstd="t" o:hr="t"/>
-        </w:pict>
-      </w:r>
-    </w:p>
-    <w:bookmarkEnd w:id="29"/>
-    <w:bookmarkStart w:id="30" w:name="practical-implications"/>
+    <w:bookmarkEnd w:id="30"/>
+    <w:bookmarkStart w:id="31" w:name="practical-implications"/>
     <w:p>
       <w:pPr>
         <w:pStyle w:val="Heading3"/>
@@ -5383,29 +5724,41 @@
           <w:b/>
           <w:bCs/>
         </w:rPr>
-        <w:t xml:space="preserve">EFSA framework (α=0.20, one-sided, 10% margin)</w:t>
-      </w:r>
-      <w:r>
-        <w:t xml:space="preserve"> </w:t>
-      </w:r>
-      <w:r>
-        <w:t xml:space="preserve">is more lenient than conventional testing</w:t>
-      </w:r>
-      <w:r>
-        <w:br/>
-      </w:r>
-      <w:r>
-        <w:t xml:space="preserve">-</w:t>
-      </w:r>
+        <w:t xml:space="preserve">EFSA framework (</w:t>
+      </w:r>
+      <m:oMath>
+        <m:r>
+          <m:t>α</m:t>
+        </m:r>
+      </m:oMath>
       <w:r>
         <w:rPr>
           <w:b/>
           <w:bCs/>
         </w:rPr>
+        <w:t xml:space="preserve">=0.20, one-sided, 10% margin)</w:t>
+      </w:r>
+      <w:r>
+        <w:t xml:space="preserve"> </w:t>
+      </w:r>
+      <w:r>
+        <w:t xml:space="preserve">is more lenient than conventional testing</w:t>
+      </w:r>
+      <w:r>
+        <w:br/>
+      </w:r>
+      <w:r>
+        <w:t xml:space="preserve">-</w:t>
+      </w:r>
+      <w:r>
+        <w:rPr>
+          <w:b/>
+          <w:bCs/>
+        </w:rPr>
         <w:t xml:space="preserve">But still demanding</w:t>
       </w:r>
       <w:r>
-        <w:t xml:space="preserve">: requires ~75-80 colonies per arm for 80% power with CV=20%</w:t>
+        <w:t xml:space="preserve">: requires ~75-80 colonies per group for 80% power with CV=20%</w:t>
       </w:r>
       <w:r>
         <w:br/>
@@ -5471,10 +5824,21 @@
           <w:b/>
           <w:bCs/>
         </w:rPr>
-        <w:t xml:space="preserve">Bottom line</w:t>
-      </w:r>
-      <w:r>
-        <w:t xml:space="preserve">: Field studies should be designed with n≈75-100 per arm minimum to reliably demonstrate non-inferiority under EFSA guidance when CV=20% and true effect is ≤5%.</w:t>
+        <w:t xml:space="preserve">Overall conclusion</w:t>
+      </w:r>
+      <w:r>
+        <w:t xml:space="preserve">: Field studies should be designed with n≈75-100 per group minimum to reliably demonstrate non-inferiority under EFSA guidance when CV=20% and true effect is ≤5%.</w:t>
+      </w:r>
+    </w:p>
+    <w:bookmarkEnd w:id="31"/>
+    <w:bookmarkEnd w:id="32"/>
+    <w:bookmarkStart w:id="33" w:name="r-code-and-result-table"/>
+    <w:p>
+      <w:pPr>
+        <w:pStyle w:val="Heading2"/>
+      </w:pPr>
+      <w:r>
+        <w:t xml:space="preserve">R Code and Result Table</w:t>
       </w:r>
     </w:p>
     <w:p>
@@ -19160,14 +19524,9 @@
         </w:tc>
       </w:tr>
     </w:tbl>
-    <w:bookmarkEnd w:id="30"/>
-    <w:bookmarkEnd w:id="31"/>
-    <w:bookmarkEnd w:id="32"/>
-    <w:sectPr>
-      <w:footnotePr>
-        <w:numRestart w:val="eachSect"/>
-      </w:footnotePr>
-    </w:sectPr>
+    <w:bookmarkEnd w:id="33"/>
+    <w:bookmarkEnd w:id="34"/>
+    <w:sectPr/>
   </w:body>
 </w:document>
 </file>
@@ -19506,6 +19865,12 @@
   <w:num w:numId="1005">
     <w:abstractNumId w:val="991"/>
   </w:num>
+  <w:num w:numId="1006">
+    <w:abstractNumId w:val="991"/>
+  </w:num>
+  <w:num w:numId="1007">
+    <w:abstractNumId w:val="991"/>
+  </w:num>
 </w:numbering>
 </file>
 
@@ -19569,6 +19934,8 @@
     </w:pPr>
     <w:rPr>
       <w:rFonts w:asciiTheme="majorHAnsi" w:cstheme="majorBidi" w:eastAsiaTheme="majorEastAsia" w:hAnsiTheme="majorHAnsi"/>
+      <w:spacing w:val="-10"/>
+      <w:kern w:val="28"/>
       <w:sz w:val="56"/>
       <w:szCs w:val="56"/>
     </w:rPr>
@@ -19581,6 +19948,8 @@
     <w:rsid w:val="00A10FD9"/>
     <w:rPr>
       <w:rFonts w:asciiTheme="majorHAnsi" w:cstheme="majorBidi" w:eastAsiaTheme="majorEastAsia" w:hAnsiTheme="majorHAnsi"/>
+      <w:spacing w:val="-10"/>
+      <w:kern w:val="28"/>
       <w:sz w:val="56"/>
       <w:szCs w:val="56"/>
     </w:rPr>
@@ -19621,31 +19990,23 @@
   </w:style>
   <w:style w:customStyle="1" w:styleId="Author" w:type="paragraph">
     <w:name w:val="Author"/>
-    <w:basedOn w:val="Title"/>
     <w:next w:val="BodyText"/>
     <w:qFormat/>
     <w:pPr>
       <w:keepNext/>
       <w:keepLines/>
+      <w:jc w:val="center"/>
     </w:pPr>
-    <w:rPr>
-      <w:sz w:val="24"/>
-      <w:szCs w:val="24"/>
-    </w:rPr>
   </w:style>
   <w:style w:styleId="Date" w:type="paragraph">
     <w:name w:val="Date"/>
-    <w:basedOn w:val="Title"/>
     <w:next w:val="BodyText"/>
     <w:qFormat/>
     <w:pPr>
       <w:keepNext/>
       <w:keepLines/>
+      <w:jc w:val="center"/>
     </w:pPr>
-    <w:rPr>
-      <w:sz w:val="24"/>
-      <w:szCs w:val="24"/>
-    </w:rPr>
   </w:style>
   <w:style w:customStyle="1" w:styleId="AbstractTitle" w:type="paragraph">
     <w:name w:val="Abstract Title"/>

</xml_diff>